<commit_message>
docs(research): freeze Wang route and audit primitive candidates
</commit_message>
<xml_diff>
--- a/docs/research/2026-10-03/IBME项目现状与完整重建研究报告.docx
+++ b/docs/research/2026-10-03/IBME项目现状与完整重建研究报告.docx
@@ -17,7 +17,7 @@
     </w:p>
     <w:p>
       <w:r>
-        <w:t>编写日期 2026 年 10 月 3 日　对象 项目队员　性质 现状核验与技术决策依据</w:t>
+        <w:t>编写日期 2026 年 10 月 3 日　修订日期 2026 年 10 月 4 日　对象 项目队员</w:t>
       </w:r>
     </w:p>
     <w:p>
@@ -36,47 +36,28 @@
       </w:r>
     </w:p>
     <w:p>
-      <w:pPr>
-        <w:pStyle w:val="Heading1"/>
-      </w:pPr>
-      <w:r>
-        <w:t>1 主要结论与建议</w:t>
-      </w:r>
-    </w:p>
-    <w:p>
-      <w:r>
-        <w:t>我们目前做的是一个以两层格基 HIBE 和格基 IBS 为底层组件的身份基匹配加密原型。它已经把系统建立、发送者密钥提取、接收者密钥提取、加密、双向身份检查和解密串起来，拥有较清晰的模块接口、编码规则、命令行和测试。这些是可以保留的工程资产。</w:t>
-      </w:r>
-    </w:p>
-    <w:p>
-      <w:r>
-        <w:t>但当前原型还不能作为安全完整的竞赛成品。我们本次重新执行了公开参数伪造攻击：攻击者不需要 Alice 的发送者密钥，就能产生接收者认可为 Alice 所发的密文。另一个本次实验只修改密文一个字节，解密接口仍返回原消息，说明其密文完整性与赛题的篡改拒绝要求存在明确差距。全套测试的 333 项通过、10 项跳过，并没有排除这些问题。</w:t>
-      </w:r>
-    </w:p>
-    <w:p>
-      <w:r>
-        <w:t>建议采用“保留工程组织，重新建立密码学依据”的重建方式：先冻结安全目标、论文版本和算法，再建立证明条件、参数和实现之间的对应关系。不能只把矩阵维度调大，或给现有方案换上短签名，就宣称完成了安全升级。现有 HIBE 与 ABB10 原论文的具体算法结构不同，陷门采样也有教学性简化；这些差异必须逐项处理。</w:t>
-      </w:r>
-    </w:p>
-    <w:p>
+      <w:r>
+        <w:t xml:space="preserve">本次修订落实团队已经确认的决定：通用构造固定采用王老师的两层匿名 HIBE 加 IBS；不实施 Boyen–Li 增强隐私，不开发 </w:t>
+      </w:r>
       <w:r>
         <w:rPr>
-          <w:b/>
+          <w:rFonts w:ascii="Consolas" w:hAnsi="Consolas"/>
+          <w:sz w:val="19"/>
         </w:rPr>
-        <w:t>必须调研完整 IBME 方案。</w:t>
-      </w:r>
-      <w:r>
-        <w:t xml:space="preserve"> 只调研 IBS 和 HIBE 会漏掉不同通用构造对匿名性、密钥重复使用、增强隐私、CCA 安全和额外原语的要求。尤其需要补充 2026 年的研究，以及近期修订过的预印本。本文比较了 HIBE 加 IBS、匿名 IBE 加 IBS 或提取器、带证明系统的增强隐私构造，以及直接环格 IBME 等路线。</w:t>
-      </w:r>
-    </w:p>
-    <w:p>
-      <w:r>
-        <w:t>建议把项目分成三层成果：第一层是论文算法一致、参数有依据的 LWE/SIS 完整参考实例；第二层是至少另一套实际运行的方案或组合，以及环格和模格的具体实例研究；第三层是有安全论证和消融实验支持的优化、可复现评测和应用演示。第二层的额外实例数量与研究深度是我们为争取优秀成绩提出的内部目标，不能写成赛题强制要求。</w:t>
-      </w:r>
-    </w:p>
-    <w:p>
-      <w:r>
-        <w:t>国赛一等奖不能由某个方案名称或代码量保证。最有说服力的成果是：我们准确识别了哪些性质来自论文，哪些优化由自己完成；能够解释并复现攻击、修复、参数选择和性能收益；对没有实现或没有证明的性质，说明其边界。</w:t>
+        <w:t>Ext</w:t>
+      </w:r>
+      <w:r>
+        <w:t>、</w:t>
+      </w:r>
+      <w:r>
+        <w:rPr>
+          <w:rFonts w:ascii="Consolas" w:hAnsi="Consolas"/>
+          <w:sz w:val="19"/>
+        </w:rPr>
+        <w:t>ReExt</w:t>
+      </w:r>
+      <w:r>
+        <w:t xml:space="preserve"> 或另一套匿名 IBE 通用协议。研究重点转为 HIBE、IBS 的具体方案、组合前提、参数、采样、完整性保护和公平评测。初次核验的代码基点、测试与攻击记录保持原有含义，不将本次文档修订写成算法修复。</w:t>
       </w:r>
     </w:p>
     <w:p>
@@ -84,12 +65,56 @@
         <w:pStyle w:val="Heading1"/>
       </w:pPr>
       <w:r>
-        <w:t>2 远端仓库与资料版本</w:t>
+        <w:t>1 主要结论与建议</w:t>
       </w:r>
     </w:p>
     <w:p>
       <w:r>
-        <w:t xml:space="preserve">本次检查前，本地位于 </w:t>
+        <w:t>我们目前做的是一个以两层格基 HIBE 和格基 IBS 为底层组件的身份基匹配加密原型。它已经把系统建立、发送者密钥提取、接收者密钥提取、加密、双向身份检查和解密串起来，拥有较清晰的模块接口、编码规则、命令行和测试。这些是可以保留的工程资产。</w:t>
+      </w:r>
+    </w:p>
+    <w:p>
+      <w:r>
+        <w:t>但当前原型还不能作为安全完整的竞赛成品。我们在初次核验中执行了公开参数伪造攻击：攻击者不需要 Alice 的发送者密钥，就能产生接收者认可为 Alice 所发的密文。另一项初次实验只修改密文一个字节，解密接口仍返回原消息，说明其密文完整性与赛题的篡改拒绝要求存在明确差距。全套测试的 333 项通过、10 项跳过，并没有排除这些问题。</w:t>
+      </w:r>
+    </w:p>
+    <w:p>
+      <w:r>
+        <w:t>建议采用“保留工程组织，重新建立密码学依据”的重建方式：先冻结安全目标、论文版本和算法，再建立证明条件、参数和实现之间的对应关系。不能只把矩阵维度调大，或给现有方案换上短签名，就宣称完成了安全升级。现有 HIBE 与 ABB10 原论文的具体算法结构不同，陷门采样也有教学性简化；这些差异必须逐项处理。</w:t>
+      </w:r>
+    </w:p>
+    <w:p>
+      <w:r>
+        <w:rPr>
+          <w:b/>
+        </w:rPr>
+        <w:t>下一阶段必须系统调研 HIBE 和 IBS。</w:t>
+      </w:r>
+      <w:r>
+        <w:t xml:space="preserve"> 王老师论文 §4 的通用组合已经选定，底层要求仍需逐项核验：HIBE 的两层委派、自适应匿名安全性，IBS 的自适应不可伪造性，以及实际密钥复用、采样分布和参数条件。其它 IBME 文献保留为安全定义与相关工作参照，不再承担重新选择通用构造的任务。[S1]</w:t>
+      </w:r>
+    </w:p>
+    <w:p>
+      <w:r>
+        <w:t>建议把项目分成三层成果：第一层是论文算法一致、参数有依据的 LWE/SIS 完整参考实例；第二层是在同一通用构造下形成至少另一套可运行的 HIBE 或 IBS 组合，优先研究已有完整 Ring-SIS IBS，并核验环格和模格 HIBE 的适配可能；第三层是有安全论证和消融实验支持的优化、可复现评测和应用演示。第二层的额外实例数量与研究深度是内部目标，不能写成赛题强制要求。</w:t>
+      </w:r>
+    </w:p>
+    <w:p>
+      <w:r>
+        <w:t>国赛一等奖不能由某个方案名称或代码量保证。最有说服力的成果是：我们准确识别了哪些性质来自论文，哪些优化由自己完成；能够解释并复现攻击、修复、参数选择和性能收益；对没有实现或没有证明的性质，说明其边界。</w:t>
+      </w:r>
+    </w:p>
+    <w:p>
+      <w:pPr>
+        <w:pStyle w:val="Heading1"/>
+      </w:pPr>
+      <w:r>
+        <w:t>2 远端仓库与资料版本</w:t>
+      </w:r>
+    </w:p>
+    <w:p>
+      <w:r>
+        <w:t xml:space="preserve">初次检查前，本地位于 </w:t>
       </w:r>
       <w:r>
         <w:rPr>
@@ -109,7 +134,7 @@
         <w:t>origin/main</w:t>
       </w:r>
       <w:r>
-        <w:t xml:space="preserve"> 新增三条提交，本次已通过快进同步，本地与远端在核验时均为 </w:t>
+        <w:t xml:space="preserve"> 新增三条提交，通过快进同步后，初次核验时本地与远端均为 </w:t>
       </w:r>
       <w:r>
         <w:rPr>
@@ -119,7 +144,17 @@
         <w:t>b15afd6</w:t>
       </w:r>
       <w:r>
-        <w:t>。这次远端更新没有修改密码算法或测试代码。</w:t>
+        <w:t xml:space="preserve">。这次远端更新没有修改密码算法或测试代码。初版研究报告随后形成提交 </w:t>
+      </w:r>
+      <w:r>
+        <w:rPr>
+          <w:rFonts w:ascii="Consolas" w:hAnsi="Consolas"/>
+          <w:sz w:val="19"/>
+        </w:rPr>
+        <w:t>2a5ee2e</w:t>
+      </w:r>
+      <w:r>
+        <w:t>；本次修订以该文档提交为起点，保留下面的历史同步记录。</w:t>
       </w:r>
     </w:p>
     <w:tbl>
@@ -533,7 +568,7 @@
     </w:p>
     <w:p>
       <w:r>
-        <w:t>这些报告值得继续利用：它们已经注意到自我伪造、匿名 HIBE、SIS 参数和算法接口问题。不过，它们主要围绕既有 HIBE 加 IBS 路线筛选，并因假设截止日期而降低了 Module-SIS 研究优先级。现在时间条件已经改变，我们也允许更换通用构造，因此它们应作为候选资料，而不应直接成为不可更改的方案决策。</w:t>
+        <w:t>这些报告值得继续利用：它们已经注意到自我伪造、匿名 HIBE、SIS 参数和算法接口问题。不过，旧报告因假设截止日期而降低了 Module-SIS 研究优先级，该时间判断不再适用。团队现在固定 HIBE 加 IBS 通用构造，但并未冻结具体后端；候选排名应结合全文定理、具体参数和公平实测重新判断。</w:t>
       </w:r>
     </w:p>
     <w:p>
@@ -1103,6 +1138,11 @@
     <w:p>
       <w:r>
         <w:t>“抗量子”需要说明所采用的格困难假设与攻击模型。使用 SHAKE 或格矩阵并不能直接得到完整 QROM 证明，更不能得到 NIST 安全等级。标准模型与标准假设也不是同一个概念：一种方案可以基于标准 LWE 假设，但证明仍在 ROM 或 QROM 中。</w:t>
+      </w:r>
+    </w:p>
+    <w:p>
+      <w:r>
+        <w:t>题目没有明确指定 Boyen–Li 增强隐私。团队已决定不做这一性质，仍必须完成普通隐私、发送者认证、四种接口匹配情况和赛题要求的篡改拒绝。不能把取消增强隐私解释为取消匿名 HIBE，或允许忽略恶意接收者自我伪造。</w:t>
       </w:r>
     </w:p>
     <w:p>
@@ -3728,12 +3768,12 @@
         <w:pStyle w:val="Heading2"/>
       </w:pPr>
       <w:r>
-        <w:t>5.2 本次测试与攻击复现</w:t>
+        <w:t>5.2 初次核验的测试与攻击复现</w:t>
       </w:r>
     </w:p>
     <w:p>
       <w:r>
-        <w:t xml:space="preserve">本次对上述代码基点运行 </w:t>
+        <w:t xml:space="preserve">2026 年 10 月 3 日对上述代码基点运行 </w:t>
       </w:r>
       <w:r>
         <w:rPr>
@@ -3752,7 +3792,7 @@
         <w:t>333 passed, 10 skipped in 537.92s</w:t>
       </w:r>
       <w:r>
-        <w:t>。这证明既有测试在本机运行成功。它不证明 LWE 或 SIS 困难性，不证明匿名性，也不证明全体篡改输入都会被拒绝。测试时另有自查实验并行运行，因此本次测试时长不作为干净环境下的性能基准。</w:t>
+        <w:t>。这证明既有测试在本机运行成功。它不证明 LWE 或 SIS 困难性，不证明匿名性，也不证明全体篡改输入都会被拒绝。测试时另有自查实验并行运行，因此该次测试时长不作为干净环境下的性能基准。</w:t>
       </w:r>
     </w:p>
     <w:p>
@@ -5408,12 +5448,17 @@
     </w:p>
     <w:p>
       <w:r>
-        <w:t>重建时要确定针对外部攻击者、持有接收密钥的攻击者、重放及合法重新加密，各自希望保证什么。合理的密码目标通常是拒绝未经授权生成或修改的密文，而不是无状态地把所有有效重加密都识别为“曾被改动”。随机数、重复密文记录和重放策略有独立语义。我们必须将赛题的拒绝要求落实为明确的输入类型与测试预期，并选用满足目标的认证组合。</w:t>
+        <w:t>Wang 的 Definition 10 排除已由加密查询得到的接收者、发送者、消息三元组。若密文字节改变而解出的消息与签名未变，它不构成该游戏中的新消息伪造；因此单字节反例不能直接被写成对论文加强认证定理的破解。它仍是赛题完整性验收的明确缺口，需要独立认证机制。[S1]</w:t>
       </w:r>
     </w:p>
     <w:p>
       <w:r>
-        <w:t>在外层消息上加 AEAD 可以保护消息体，但若格密文胶囊或头部没有正确绑定，仍可能出现外层认证通过而胶囊被改动。CCA 安全、增强隐私和完整性不自动来自“加了 AES-GCM”这一步。</w:t>
+        <w:t>重建时要确定针对外部攻击者、持有接收密钥的攻击者、重放及合法重新加密，各自希望保证什么。合理的密码目标通常是拒绝未经授权生成或修改的密文，而不是无状态地把所有有效重加密都识别为“曾被改动”。随机数、重复密文记录和重放策略有独立语义。我们必须将赛题的拒绝要求落实为明确的输入类型与测试预期，并选用满足目标的认证组合。</w:t>
+      </w:r>
+    </w:p>
+    <w:p>
+      <w:r>
+        <w:t>在外层消息上加 AEAD 可以保护消息体，但若格密文胶囊或头部没有正确绑定，仍可能出现外层认证通过而胶囊被改动。CCA 安全和完整性不自动来自“加了 AES-GCM”这一步。这里研究的是固定通用构造的认证封装，不引入 Boyen–Li 提取器路线。</w:t>
       </w:r>
     </w:p>
     <w:p>
@@ -5426,27 +5471,7 @@
     </w:p>
     <w:p>
       <w:r>
-        <w:t xml:space="preserve">当前没有可宣称安全的正式参数集，没有完整的增强隐私 </w:t>
-      </w:r>
-      <w:r>
-        <w:rPr>
-          <w:rFonts w:ascii="Consolas" w:hAnsi="Consolas"/>
-          <w:sz w:val="19"/>
-        </w:rPr>
-        <w:t>Ext</w:t>
-      </w:r>
-      <w:r>
-        <w:t xml:space="preserve"> 和 </w:t>
-      </w:r>
-      <w:r>
-        <w:rPr>
-          <w:rFonts w:ascii="Consolas" w:hAnsi="Consolas"/>
-          <w:sz w:val="19"/>
-        </w:rPr>
-        <w:t>ReExt</w:t>
-      </w:r>
-      <w:r>
-        <w:t xml:space="preserve"> 实现，也没有相应身份熵条件证据。一般批量测试、多个格方案实例比较、原生内存统计及完整可视化仍需完成。现阶段能证明的是教学流程有运行基础，不能证明已经完成赛题要求的安全实例。</w:t>
+        <w:t>当前没有可宣称安全的正式参数集。一般批量测试、多个格方案实例比较、原生内存统计及完整可视化仍需完成。现阶段能证明的是教学流程有运行基础，不能证明已经完成赛题要求的安全实例。Boyen–Li 组件不属于已确认项目范围，其不存在不再计为待完成项。</w:t>
       </w:r>
     </w:p>
     <w:p>
@@ -6803,7 +6828,7 @@
         <w:pStyle w:val="Heading1"/>
       </w:pPr>
       <w:r>
-        <w:t>8 为什么需要重新调研通用 IBME 构造</w:t>
+        <w:t>8 已确认通用构造与隐私边界</w:t>
       </w:r>
     </w:p>
     <w:p>
@@ -6811,22 +6836,17 @@
         <w:pStyle w:val="Heading2"/>
       </w:pPr>
       <w:r>
-        <w:t>8.1 调研应先回答安全能力问题</w:t>
+        <w:t>8.1 固定王老师的通用组合</w:t>
       </w:r>
     </w:p>
     <w:p>
       <w:r>
-        <w:t>选型顺序应从目标出发：我们需要的隐私和认证游戏是什么；它要求哪些原语性质；有哪些论文确实证明这些性质；能否给出实际参数和正确采样；最后才比较速度和尺寸。不能先选一个实现快的加密或签名，再假定它满足全部前提。</w:t>
+        <w:t>本项目采用 Wang 等论文 §4.1 的 Construction 1；安全前提以 §4.2 的 Theorem 4.2 为准。匿名两层 HIBE 提供普通隐私，自适应安全 IBS 提供加强认证。发送身份位于第二层，接收身份位于第一层；对接收者身份与消息签名，再加密签名与消息。这个组合顺序已经确定。[S1]</w:t>
       </w:r>
     </w:p>
     <w:p>
       <w:r>
-        <w:t>必须区分以下概念：消息机密性；密文是否隐藏接收者身份；密文是否隐藏发送者身份；错误发送者条件下，持有正确接收者密钥的恶意用户是否仍能获知消息；外部伪造与合法接收者自我伪造；是否允许解密查询；是否支持身份和消息自适应选择；同一用户密钥是否被重复使用。</w:t>
-      </w:r>
-    </w:p>
-    <w:p>
-      <w:r>
-        <w:t>增强隐私是比“API 验签失败返回失败”更强的要求。恶意接收者控制自己设备，可以检查验签前的中间消息，或重写客户端。因此，把解密结果藏在正常客户端界面上并不构成增强隐私证明。</w:t>
+        <w:t>底层方案尚未冻结。接下来从所需安全定义出发，核对具体 HIBE 和 IBS 的算法、定理、模型、采样和参数，然后在可比条件下测量尺寸与速度。软件接口能接入某个后端，不表示该后端已经满足组合定理。</w:t>
       </w:r>
     </w:p>
     <w:p>
@@ -6834,963 +6854,40 @@
         <w:pStyle w:val="Heading2"/>
       </w:pPr>
       <w:r>
-        <w:t>8.2 应纳入比较的完整 IBME 路线</w:t>
+        <w:t>8.2 不实施增强隐私的技术含义</w:t>
       </w:r>
     </w:p>
     <w:p>
       <w:r>
-        <w:t>表中“原文相关部分”表示已经取得原文并读取构造或相应章节，仍不意味着全部证明逐行核验；“摘要”表示只核验了原始出版社摘要和元数据。</w:t>
+        <w:t>Wang 等 §3 的 Definition 9 限制隐私攻击者不能取得目标接收者的解密密钥。其 Definition 10 的加强认证则允许目标接收者已经被腐化，用于覆盖自我伪造。两个游戏的权限不同：不做增强隐私，不会取消对恶意接收者伪造发送者的防护目标。[S1]</w:t>
       </w:r>
     </w:p>
-    <w:tbl>
-      <w:tblPr>
-        <w:tblW w:type="auto" w:w="0"/>
-        <w:jc w:val="center"/>
-        <w:tblLayout w:type="fixed"/>
-        <w:tblLook w:firstColumn="1" w:firstRow="1" w:lastColumn="0" w:lastRow="0" w:noHBand="0" w:noVBand="1" w:val="04A0"/>
-        <w:tblBorders>
-          <w:top w:val="single" w:sz="4" w:color="D9D9D9"/>
-          <w:left w:val="single" w:sz="4" w:color="D9D9D9"/>
-          <w:bottom w:val="single" w:sz="4" w:color="D9D9D9"/>
-          <w:right w:val="single" w:sz="4" w:color="D9D9D9"/>
-          <w:insideH w:val="single" w:sz="4" w:color="D9D9D9"/>
-          <w:insideV w:val="single" w:sz="4" w:color="D9D9D9"/>
-        </w:tblBorders>
-      </w:tblPr>
-      <w:tblGrid>
-        <w:gridCol w:w="2520"/>
-        <w:gridCol w:w="1728"/>
-        <w:gridCol w:w="2880"/>
-        <w:gridCol w:w="2952"/>
-      </w:tblGrid>
-      <w:tr>
-        <w:trPr>
-          <w:cantSplit/>
-          <w:tblHeader w:val="true"/>
-        </w:trPr>
-        <w:tc>
-          <w:tcPr>
-            <w:tcW w:type="dxa" w:w="2520"/>
-            <w:vAlign w:val="center"/>
-            <w:tcMar>
-              <w:top w:w="85" w:type="dxa"/>
-              <w:bottom w:w="85" w:type="dxa"/>
-              <w:left w:w="100" w:type="dxa"/>
-              <w:right w:w="100" w:type="dxa"/>
-            </w:tcMar>
-            <w:shd w:fill="17365D"/>
-          </w:tcPr>
-          <w:p>
-            <w:pPr>
-              <w:widowControl/>
-              <w:spacing w:after="0" w:line="278" w:lineRule="auto"/>
-              <w:jc w:val="center"/>
-            </w:pPr>
-            <w:r>
-              <w:rPr>
-                <w:b/>
-                <w:color w:val="FFFFFF"/>
-                <w:sz w:val="20"/>
-              </w:rPr>
-              <w:t>路线及文献</w:t>
-            </w:r>
-          </w:p>
-        </w:tc>
-        <w:tc>
-          <w:tcPr>
-            <w:tcW w:type="dxa" w:w="1728"/>
-            <w:vAlign w:val="center"/>
-            <w:tcMar>
-              <w:top w:w="85" w:type="dxa"/>
-              <w:bottom w:w="85" w:type="dxa"/>
-              <w:left w:w="100" w:type="dxa"/>
-              <w:right w:w="100" w:type="dxa"/>
-            </w:tcMar>
-            <w:shd w:fill="17365D"/>
-          </w:tcPr>
-          <w:p>
-            <w:pPr>
-              <w:widowControl/>
-              <w:spacing w:after="0" w:line="278" w:lineRule="auto"/>
-              <w:jc w:val="center"/>
-            </w:pPr>
-            <w:r>
-              <w:rPr>
-                <w:b/>
-                <w:color w:val="FFFFFF"/>
-                <w:sz w:val="20"/>
-              </w:rPr>
-              <w:t>调研深度</w:t>
-            </w:r>
-          </w:p>
-        </w:tc>
-        <w:tc>
-          <w:tcPr>
-            <w:tcW w:type="dxa" w:w="2880"/>
-            <w:vAlign w:val="center"/>
-            <w:tcMar>
-              <w:top w:w="85" w:type="dxa"/>
-              <w:bottom w:w="85" w:type="dxa"/>
-              <w:left w:w="100" w:type="dxa"/>
-              <w:right w:w="100" w:type="dxa"/>
-            </w:tcMar>
-            <w:shd w:fill="17365D"/>
-          </w:tcPr>
-          <w:p>
-            <w:pPr>
-              <w:widowControl/>
-              <w:spacing w:after="0" w:line="278" w:lineRule="auto"/>
-              <w:jc w:val="center"/>
-            </w:pPr>
-            <w:r>
-              <w:rPr>
-                <w:b/>
-                <w:color w:val="FFFFFF"/>
-                <w:sz w:val="20"/>
-              </w:rPr>
-              <w:t>主要研究价值</w:t>
-            </w:r>
-          </w:p>
-        </w:tc>
-        <w:tc>
-          <w:tcPr>
-            <w:tcW w:type="dxa" w:w="2952"/>
-            <w:vAlign w:val="center"/>
-            <w:tcMar>
-              <w:top w:w="85" w:type="dxa"/>
-              <w:bottom w:w="85" w:type="dxa"/>
-              <w:left w:w="100" w:type="dxa"/>
-              <w:right w:w="100" w:type="dxa"/>
-            </w:tcMar>
-            <w:shd w:fill="17365D"/>
-          </w:tcPr>
-          <w:p>
-            <w:pPr>
-              <w:widowControl/>
-              <w:spacing w:after="0" w:line="278" w:lineRule="auto"/>
-              <w:jc w:val="center"/>
-            </w:pPr>
-            <w:r>
-              <w:rPr>
-                <w:b/>
-                <w:color w:val="FFFFFF"/>
-                <w:sz w:val="20"/>
-              </w:rPr>
-              <w:t>选型关口</w:t>
-            </w:r>
-          </w:p>
-        </w:tc>
-      </w:tr>
-      <w:tr>
-        <w:trPr>
-          <w:cantSplit/>
-        </w:trPr>
-        <w:tc>
-          <w:tcPr>
-            <w:tcW w:type="dxa" w:w="2520"/>
-            <w:vAlign w:val="center"/>
-            <w:tcMar>
-              <w:top w:w="85" w:type="dxa"/>
-              <w:bottom w:w="85" w:type="dxa"/>
-              <w:left w:w="100" w:type="dxa"/>
-              <w:right w:w="100" w:type="dxa"/>
-            </w:tcMar>
-            <w:shd w:fill="F2F5F8"/>
-          </w:tcPr>
-          <w:p>
-            <w:pPr>
-              <w:widowControl/>
-              <w:spacing w:after="0" w:line="278" w:lineRule="auto"/>
-            </w:pPr>
-            <w:r>
-              <w:rPr>
-                <w:sz w:val="20"/>
-              </w:rPr>
-              <w:t>Wang 等 HIBE 加 IBS [S1]</w:t>
-            </w:r>
-          </w:p>
-        </w:tc>
-        <w:tc>
-          <w:tcPr>
-            <w:tcW w:type="dxa" w:w="1728"/>
-            <w:vAlign w:val="center"/>
-            <w:tcMar>
-              <w:top w:w="85" w:type="dxa"/>
-              <w:bottom w:w="85" w:type="dxa"/>
-              <w:left w:w="100" w:type="dxa"/>
-              <w:right w:w="100" w:type="dxa"/>
-            </w:tcMar>
-            <w:shd w:fill="F2F5F8"/>
-          </w:tcPr>
-          <w:p>
-            <w:pPr>
-              <w:widowControl/>
-              <w:spacing w:after="0" w:line="278" w:lineRule="auto"/>
-            </w:pPr>
-            <w:r>
-              <w:rPr>
-                <w:sz w:val="20"/>
-              </w:rPr>
-              <w:t>原文相关部分及本地论文</w:t>
-            </w:r>
-          </w:p>
-        </w:tc>
-        <w:tc>
-          <w:tcPr>
-            <w:tcW w:type="dxa" w:w="2880"/>
-            <w:vAlign w:val="center"/>
-            <w:tcMar>
-              <w:top w:w="85" w:type="dxa"/>
-              <w:bottom w:w="85" w:type="dxa"/>
-              <w:left w:w="100" w:type="dxa"/>
-              <w:right w:w="100" w:type="dxa"/>
-            </w:tcMar>
-            <w:shd w:fill="F2F5F8"/>
-          </w:tcPr>
-          <w:p>
-            <w:pPr>
-              <w:widowControl/>
-              <w:spacing w:after="0" w:line="278" w:lineRule="auto"/>
-            </w:pPr>
-            <w:r>
-              <w:rPr>
-                <w:sz w:val="20"/>
-              </w:rPr>
-              <w:t>当前流程的理论参照</w:t>
-            </w:r>
-          </w:p>
-        </w:tc>
-        <w:tc>
-          <w:tcPr>
-            <w:tcW w:type="dxa" w:w="2952"/>
-            <w:vAlign w:val="center"/>
-            <w:tcMar>
-              <w:top w:w="85" w:type="dxa"/>
-              <w:bottom w:w="85" w:type="dxa"/>
-              <w:left w:w="100" w:type="dxa"/>
-              <w:right w:w="100" w:type="dxa"/>
-            </w:tcMar>
-            <w:shd w:fill="F2F5F8"/>
-          </w:tcPr>
-          <w:p>
-            <w:pPr>
-              <w:widowControl/>
-              <w:spacing w:after="0" w:line="278" w:lineRule="auto"/>
-            </w:pPr>
-            <w:r>
-              <w:rPr>
-                <w:sz w:val="20"/>
-              </w:rPr>
-              <w:t>精确 HIBE 与自适应 IBS 及完整性模型</w:t>
-            </w:r>
-          </w:p>
-        </w:tc>
-      </w:tr>
-      <w:tr>
-        <w:trPr>
-          <w:cantSplit/>
-        </w:trPr>
-        <w:tc>
-          <w:tcPr>
-            <w:tcW w:type="dxa" w:w="2520"/>
-            <w:vAlign w:val="center"/>
-            <w:tcMar>
-              <w:top w:w="85" w:type="dxa"/>
-              <w:bottom w:w="85" w:type="dxa"/>
-              <w:left w:w="100" w:type="dxa"/>
-              <w:right w:w="100" w:type="dxa"/>
-            </w:tcMar>
-            <w:shd w:fill="FFFFFF"/>
-          </w:tcPr>
-          <w:p>
-            <w:pPr>
-              <w:widowControl/>
-              <w:spacing w:after="0" w:line="278" w:lineRule="auto"/>
-            </w:pPr>
-            <w:r>
-              <w:rPr>
-                <w:sz w:val="20"/>
-              </w:rPr>
-              <w:t>Boyen Li 增强隐私 [S5]</w:t>
-            </w:r>
-          </w:p>
-        </w:tc>
-        <w:tc>
-          <w:tcPr>
-            <w:tcW w:type="dxa" w:w="1728"/>
-            <w:vAlign w:val="center"/>
-            <w:tcMar>
-              <w:top w:w="85" w:type="dxa"/>
-              <w:bottom w:w="85" w:type="dxa"/>
-              <w:left w:w="100" w:type="dxa"/>
-              <w:right w:w="100" w:type="dxa"/>
-            </w:tcMar>
-            <w:shd w:fill="FFFFFF"/>
-          </w:tcPr>
-          <w:p>
-            <w:pPr>
-              <w:widowControl/>
-              <w:spacing w:after="0" w:line="278" w:lineRule="auto"/>
-            </w:pPr>
-            <w:r>
-              <w:rPr>
-                <w:sz w:val="20"/>
-              </w:rPr>
-              <w:t>本地原文相关部分</w:t>
-            </w:r>
-          </w:p>
-        </w:tc>
-        <w:tc>
-          <w:tcPr>
-            <w:tcW w:type="dxa" w:w="2880"/>
-            <w:vAlign w:val="center"/>
-            <w:tcMar>
-              <w:top w:w="85" w:type="dxa"/>
-              <w:bottom w:w="85" w:type="dxa"/>
-              <w:left w:w="100" w:type="dxa"/>
-              <w:right w:w="100" w:type="dxa"/>
-            </w:tcMar>
-            <w:shd w:fill="FFFFFF"/>
-          </w:tcPr>
-          <w:p>
-            <w:pPr>
-              <w:widowControl/>
-              <w:spacing w:after="0" w:line="278" w:lineRule="auto"/>
-            </w:pPr>
-            <w:r>
-              <w:rPr>
-                <w:sz w:val="20"/>
-              </w:rPr>
-              <w:t>匿名 IBE IBS 提取器的通用路线</w:t>
-            </w:r>
-          </w:p>
-        </w:tc>
-        <w:tc>
-          <w:tcPr>
-            <w:tcW w:type="dxa" w:w="2952"/>
-            <w:vAlign w:val="center"/>
-            <w:tcMar>
-              <w:top w:w="85" w:type="dxa"/>
-              <w:bottom w:w="85" w:type="dxa"/>
-              <w:left w:w="100" w:type="dxa"/>
-              <w:right w:w="100" w:type="dxa"/>
-            </w:tcMar>
-            <w:shd w:fill="FFFFFF"/>
-          </w:tcPr>
-          <w:p>
-            <w:pPr>
-              <w:widowControl/>
-              <w:spacing w:after="0" w:line="278" w:lineRule="auto"/>
-            </w:pPr>
-            <w:r>
-              <w:rPr>
-                <w:rFonts w:ascii="Consolas" w:hAnsi="Consolas"/>
-                <w:sz w:val="20"/>
-              </w:rPr>
-              <w:t>Ext</w:t>
-            </w:r>
-            <w:r>
-              <w:rPr>
-                <w:sz w:val="20"/>
-              </w:rPr>
-              <w:t xml:space="preserve"> </w:t>
-            </w:r>
-            <w:r>
-              <w:rPr>
-                <w:rFonts w:ascii="Consolas" w:hAnsi="Consolas"/>
-                <w:sz w:val="20"/>
-              </w:rPr>
-              <w:t>ReExt</w:t>
-            </w:r>
-            <w:r>
-              <w:rPr>
-                <w:sz w:val="20"/>
-              </w:rPr>
-              <w:t xml:space="preserve"> 与身份熵条件</w:t>
-            </w:r>
-          </w:p>
-        </w:tc>
-      </w:tr>
-      <w:tr>
-        <w:trPr>
-          <w:cantSplit/>
-        </w:trPr>
-        <w:tc>
-          <w:tcPr>
-            <w:tcW w:type="dxa" w:w="2520"/>
-            <w:vAlign w:val="center"/>
-            <w:tcMar>
-              <w:top w:w="85" w:type="dxa"/>
-              <w:bottom w:w="85" w:type="dxa"/>
-              <w:left w:w="100" w:type="dxa"/>
-              <w:right w:w="100" w:type="dxa"/>
-            </w:tcMar>
-            <w:shd w:fill="F2F5F8"/>
-          </w:tcPr>
-          <w:p>
-            <w:pPr>
-              <w:widowControl/>
-              <w:spacing w:after="0" w:line="278" w:lineRule="auto"/>
-            </w:pPr>
-            <w:r>
-              <w:rPr>
-                <w:sz w:val="20"/>
-              </w:rPr>
-              <w:t>Cimorelli Belfiore 等 ACNS 2024 [S6]</w:t>
-            </w:r>
-          </w:p>
-        </w:tc>
-        <w:tc>
-          <w:tcPr>
-            <w:tcW w:type="dxa" w:w="1728"/>
-            <w:vAlign w:val="center"/>
-            <w:tcMar>
-              <w:top w:w="85" w:type="dxa"/>
-              <w:bottom w:w="85" w:type="dxa"/>
-              <w:left w:w="100" w:type="dxa"/>
-              <w:right w:w="100" w:type="dxa"/>
-            </w:tcMar>
-            <w:shd w:fill="F2F5F8"/>
-          </w:tcPr>
-          <w:p>
-            <w:pPr>
-              <w:widowControl/>
-              <w:spacing w:after="0" w:line="278" w:lineRule="auto"/>
-            </w:pPr>
-            <w:r>
-              <w:rPr>
-                <w:sz w:val="20"/>
-              </w:rPr>
-              <w:t>作者与机构摘要</w:t>
-            </w:r>
-          </w:p>
-        </w:tc>
-        <w:tc>
-          <w:tcPr>
-            <w:tcW w:type="dxa" w:w="2880"/>
-            <w:vAlign w:val="center"/>
-            <w:tcMar>
-              <w:top w:w="85" w:type="dxa"/>
-              <w:bottom w:w="85" w:type="dxa"/>
-              <w:left w:w="100" w:type="dxa"/>
-              <w:right w:w="100" w:type="dxa"/>
-            </w:tcMar>
-            <w:shd w:fill="F2F5F8"/>
-          </w:tcPr>
-          <w:p>
-            <w:pPr>
-              <w:widowControl/>
-              <w:spacing w:after="0" w:line="278" w:lineRule="auto"/>
-            </w:pPr>
-            <w:r>
-              <w:rPr>
-                <w:sz w:val="20"/>
-              </w:rPr>
-              <w:t>标准格假设下另一类组合</w:t>
-            </w:r>
-          </w:p>
-        </w:tc>
-        <w:tc>
-          <w:tcPr>
-            <w:tcW w:type="dxa" w:w="2952"/>
-            <w:vAlign w:val="center"/>
-            <w:tcMar>
-              <w:top w:w="85" w:type="dxa"/>
-              <w:bottom w:w="85" w:type="dxa"/>
-              <w:left w:w="100" w:type="dxa"/>
-              <w:right w:w="100" w:type="dxa"/>
-            </w:tcMar>
-            <w:shd w:fill="F2F5F8"/>
-          </w:tcPr>
-          <w:p>
-            <w:pPr>
-              <w:widowControl/>
-              <w:spacing w:after="0" w:line="278" w:lineRule="auto"/>
-            </w:pPr>
-            <w:r>
-              <w:rPr>
-                <w:sz w:val="20"/>
-              </w:rPr>
-              <w:t>可复用提取器与上下文隐藏同态签名</w:t>
-            </w:r>
-          </w:p>
-        </w:tc>
-      </w:tr>
-      <w:tr>
-        <w:trPr>
-          <w:cantSplit/>
-        </w:trPr>
-        <w:tc>
-          <w:tcPr>
-            <w:tcW w:type="dxa" w:w="2520"/>
-            <w:vAlign w:val="center"/>
-            <w:tcMar>
-              <w:top w:w="85" w:type="dxa"/>
-              <w:bottom w:w="85" w:type="dxa"/>
-              <w:left w:w="100" w:type="dxa"/>
-              <w:right w:w="100" w:type="dxa"/>
-            </w:tcMar>
-            <w:shd w:fill="FFFFFF"/>
-          </w:tcPr>
-          <w:p>
-            <w:pPr>
-              <w:widowControl/>
-              <w:spacing w:after="0" w:line="278" w:lineRule="auto"/>
-            </w:pPr>
-            <w:r>
-              <w:rPr>
-                <w:sz w:val="20"/>
-              </w:rPr>
-              <w:t>Chiku 等修订稿 [S7]</w:t>
-            </w:r>
-          </w:p>
-        </w:tc>
-        <w:tc>
-          <w:tcPr>
-            <w:tcW w:type="dxa" w:w="1728"/>
-            <w:vAlign w:val="center"/>
-            <w:tcMar>
-              <w:top w:w="85" w:type="dxa"/>
-              <w:bottom w:w="85" w:type="dxa"/>
-              <w:left w:w="100" w:type="dxa"/>
-              <w:right w:w="100" w:type="dxa"/>
-            </w:tcMar>
-            <w:shd w:fill="FFFFFF"/>
-          </w:tcPr>
-          <w:p>
-            <w:pPr>
-              <w:widowControl/>
-              <w:spacing w:after="0" w:line="278" w:lineRule="auto"/>
-            </w:pPr>
-            <w:r>
-              <w:rPr>
-                <w:sz w:val="20"/>
-              </w:rPr>
-              <w:t>2026 版相关构造与比较</w:t>
-            </w:r>
-          </w:p>
-        </w:tc>
-        <w:tc>
-          <w:tcPr>
-            <w:tcW w:type="dxa" w:w="2880"/>
-            <w:vAlign w:val="center"/>
-            <w:tcMar>
-              <w:top w:w="85" w:type="dxa"/>
-              <w:bottom w:w="85" w:type="dxa"/>
-              <w:left w:w="100" w:type="dxa"/>
-              <w:right w:w="100" w:type="dxa"/>
-            </w:tcMar>
-            <w:shd w:fill="FFFFFF"/>
-          </w:tcPr>
-          <w:p>
-            <w:pPr>
-              <w:widowControl/>
-              <w:spacing w:after="0" w:line="278" w:lineRule="auto"/>
-            </w:pPr>
-            <w:r>
-              <w:rPr>
-                <w:sz w:val="20"/>
-              </w:rPr>
-              <w:t>增强隐私与 CCA 模型核对</w:t>
-            </w:r>
-          </w:p>
-        </w:tc>
-        <w:tc>
-          <w:tcPr>
-            <w:tcW w:type="dxa" w:w="2952"/>
-            <w:vAlign w:val="center"/>
-            <w:tcMar>
-              <w:top w:w="85" w:type="dxa"/>
-              <w:bottom w:w="85" w:type="dxa"/>
-              <w:left w:w="100" w:type="dxa"/>
-              <w:right w:w="100" w:type="dxa"/>
-            </w:tcMar>
-            <w:shd w:fill="FFFFFF"/>
-          </w:tcPr>
-          <w:p>
-            <w:pPr>
-              <w:widowControl/>
-              <w:spacing w:after="0" w:line="278" w:lineRule="auto"/>
-            </w:pPr>
-            <w:r>
-              <w:rPr>
-                <w:sz w:val="20"/>
-              </w:rPr>
-              <w:t>普通签名 证明系统及提取器的开销</w:t>
-            </w:r>
-          </w:p>
-        </w:tc>
-      </w:tr>
-      <w:tr>
-        <w:trPr>
-          <w:cantSplit/>
-        </w:trPr>
-        <w:tc>
-          <w:tcPr>
-            <w:tcW w:type="dxa" w:w="2520"/>
-            <w:vAlign w:val="center"/>
-            <w:tcMar>
-              <w:top w:w="85" w:type="dxa"/>
-              <w:bottom w:w="85" w:type="dxa"/>
-              <w:left w:w="100" w:type="dxa"/>
-              <w:right w:w="100" w:type="dxa"/>
-            </w:tcMar>
-            <w:shd w:fill="F2F5F8"/>
-          </w:tcPr>
-          <w:p>
-            <w:pPr>
-              <w:widowControl/>
-              <w:spacing w:after="0" w:line="278" w:lineRule="auto"/>
-            </w:pPr>
-            <w:r>
-              <w:rPr>
-                <w:sz w:val="20"/>
-              </w:rPr>
-              <w:t>Li Qin Boyen ACISP 2026 [S8]</w:t>
-            </w:r>
-          </w:p>
-        </w:tc>
-        <w:tc>
-          <w:tcPr>
-            <w:tcW w:type="dxa" w:w="1728"/>
-            <w:vAlign w:val="center"/>
-            <w:tcMar>
-              <w:top w:w="85" w:type="dxa"/>
-              <w:bottom w:w="85" w:type="dxa"/>
-              <w:left w:w="100" w:type="dxa"/>
-              <w:right w:w="100" w:type="dxa"/>
-            </w:tcMar>
-            <w:shd w:fill="F2F5F8"/>
-          </w:tcPr>
-          <w:p>
-            <w:pPr>
-              <w:widowControl/>
-              <w:spacing w:after="0" w:line="278" w:lineRule="auto"/>
-            </w:pPr>
-            <w:r>
-              <w:rPr>
-                <w:sz w:val="20"/>
-              </w:rPr>
-              <w:t>出版社摘要</w:t>
-            </w:r>
-          </w:p>
-        </w:tc>
-        <w:tc>
-          <w:tcPr>
-            <w:tcW w:type="dxa" w:w="2880"/>
-            <w:vAlign w:val="center"/>
-            <w:tcMar>
-              <w:top w:w="85" w:type="dxa"/>
-              <w:bottom w:w="85" w:type="dxa"/>
-              <w:left w:w="100" w:type="dxa"/>
-              <w:right w:w="100" w:type="dxa"/>
-            </w:tcMar>
-            <w:shd w:fill="F2F5F8"/>
-          </w:tcPr>
-          <w:p>
-            <w:pPr>
-              <w:widowControl/>
-              <w:spacing w:after="0" w:line="278" w:lineRule="auto"/>
-            </w:pPr>
-            <w:r>
-              <w:rPr>
-                <w:sz w:val="20"/>
-              </w:rPr>
-              <w:t>增强隐私 CCA 及格实例实现</w:t>
-            </w:r>
-          </w:p>
-        </w:tc>
-        <w:tc>
-          <w:tcPr>
-            <w:tcW w:type="dxa" w:w="2952"/>
-            <w:vAlign w:val="center"/>
-            <w:tcMar>
-              <w:top w:w="85" w:type="dxa"/>
-              <w:bottom w:w="85" w:type="dxa"/>
-              <w:left w:w="100" w:type="dxa"/>
-              <w:right w:w="100" w:type="dxa"/>
-            </w:tcMar>
-            <w:shd w:fill="F2F5F8"/>
-          </w:tcPr>
-          <w:p>
-            <w:pPr>
-              <w:widowControl/>
-              <w:spacing w:after="0" w:line="278" w:lineRule="auto"/>
-            </w:pPr>
-            <w:r>
-              <w:rPr>
-                <w:sz w:val="20"/>
-              </w:rPr>
-              <w:t>需取得全文与代码核验</w:t>
-            </w:r>
-          </w:p>
-        </w:tc>
-      </w:tr>
-      <w:tr>
-        <w:trPr>
-          <w:cantSplit/>
-        </w:trPr>
-        <w:tc>
-          <w:tcPr>
-            <w:tcW w:type="dxa" w:w="2520"/>
-            <w:vAlign w:val="center"/>
-            <w:tcMar>
-              <w:top w:w="85" w:type="dxa"/>
-              <w:bottom w:w="85" w:type="dxa"/>
-              <w:left w:w="100" w:type="dxa"/>
-              <w:right w:w="100" w:type="dxa"/>
-            </w:tcMar>
-            <w:shd w:fill="FFFFFF"/>
-          </w:tcPr>
-          <w:p>
-            <w:pPr>
-              <w:widowControl/>
-              <w:spacing w:after="0" w:line="278" w:lineRule="auto"/>
-            </w:pPr>
-            <w:r>
-              <w:rPr>
-                <w:sz w:val="20"/>
-              </w:rPr>
-              <w:t>Yu 等 TCS 2026 [S3]</w:t>
-            </w:r>
-          </w:p>
-        </w:tc>
-        <w:tc>
-          <w:tcPr>
-            <w:tcW w:type="dxa" w:w="1728"/>
-            <w:vAlign w:val="center"/>
-            <w:tcMar>
-              <w:top w:w="85" w:type="dxa"/>
-              <w:bottom w:w="85" w:type="dxa"/>
-              <w:left w:w="100" w:type="dxa"/>
-              <w:right w:w="100" w:type="dxa"/>
-            </w:tcMar>
-            <w:shd w:fill="FFFFFF"/>
-          </w:tcPr>
-          <w:p>
-            <w:pPr>
-              <w:widowControl/>
-              <w:spacing w:after="0" w:line="278" w:lineRule="auto"/>
-            </w:pPr>
-            <w:r>
-              <w:rPr>
-                <w:sz w:val="20"/>
-              </w:rPr>
-              <w:t>出版社摘要及构造概述</w:t>
-            </w:r>
-          </w:p>
-        </w:tc>
-        <w:tc>
-          <w:tcPr>
-            <w:tcW w:type="dxa" w:w="2880"/>
-            <w:vAlign w:val="center"/>
-            <w:tcMar>
-              <w:top w:w="85" w:type="dxa"/>
-              <w:bottom w:w="85" w:type="dxa"/>
-              <w:left w:w="100" w:type="dxa"/>
-              <w:right w:w="100" w:type="dxa"/>
-            </w:tcMar>
-            <w:shd w:fill="FFFFFF"/>
-          </w:tcPr>
-          <w:p>
-            <w:pPr>
-              <w:widowControl/>
-              <w:spacing w:after="0" w:line="278" w:lineRule="auto"/>
-            </w:pPr>
-            <w:r>
-              <w:rPr>
-                <w:sz w:val="20"/>
-              </w:rPr>
-              <w:t>密钥重复使用与 IBE 加 IBS</w:t>
-            </w:r>
-          </w:p>
-        </w:tc>
-        <w:tc>
-          <w:tcPr>
-            <w:tcW w:type="dxa" w:w="2952"/>
-            <w:vAlign w:val="center"/>
-            <w:tcMar>
-              <w:top w:w="85" w:type="dxa"/>
-              <w:bottom w:w="85" w:type="dxa"/>
-              <w:left w:w="100" w:type="dxa"/>
-              <w:right w:w="100" w:type="dxa"/>
-            </w:tcMar>
-            <w:shd w:fill="FFFFFF"/>
-          </w:tcPr>
-          <w:p>
-            <w:pPr>
-              <w:widowControl/>
-              <w:spacing w:after="0" w:line="278" w:lineRule="auto"/>
-            </w:pPr>
-            <w:r>
-              <w:rPr>
-                <w:sz w:val="20"/>
-              </w:rPr>
-              <w:t>标准模型前提与实际参数</w:t>
-            </w:r>
-          </w:p>
-        </w:tc>
-      </w:tr>
-      <w:tr>
-        <w:trPr>
-          <w:cantSplit/>
-        </w:trPr>
-        <w:tc>
-          <w:tcPr>
-            <w:tcW w:type="dxa" w:w="2520"/>
-            <w:vAlign w:val="center"/>
-            <w:tcMar>
-              <w:top w:w="85" w:type="dxa"/>
-              <w:bottom w:w="85" w:type="dxa"/>
-              <w:left w:w="100" w:type="dxa"/>
-              <w:right w:w="100" w:type="dxa"/>
-            </w:tcMar>
-            <w:shd w:fill="F2F5F8"/>
-          </w:tcPr>
-          <w:p>
-            <w:pPr>
-              <w:widowControl/>
-              <w:spacing w:after="0" w:line="278" w:lineRule="auto"/>
-            </w:pPr>
-            <w:r>
-              <w:rPr>
-                <w:sz w:val="20"/>
-              </w:rPr>
-              <w:t>IBMEIL 2026 [S9]</w:t>
-            </w:r>
-          </w:p>
-        </w:tc>
-        <w:tc>
-          <w:tcPr>
-            <w:tcW w:type="dxa" w:w="1728"/>
-            <w:vAlign w:val="center"/>
-            <w:tcMar>
-              <w:top w:w="85" w:type="dxa"/>
-              <w:bottom w:w="85" w:type="dxa"/>
-              <w:left w:w="100" w:type="dxa"/>
-              <w:right w:w="100" w:type="dxa"/>
-            </w:tcMar>
-            <w:shd w:fill="F2F5F8"/>
-          </w:tcPr>
-          <w:p>
-            <w:pPr>
-              <w:widowControl/>
-              <w:spacing w:after="0" w:line="278" w:lineRule="auto"/>
-            </w:pPr>
-            <w:r>
-              <w:rPr>
-                <w:sz w:val="20"/>
-              </w:rPr>
-              <w:t>出版社摘要</w:t>
-            </w:r>
-          </w:p>
-        </w:tc>
-        <w:tc>
-          <w:tcPr>
-            <w:tcW w:type="dxa" w:w="2880"/>
-            <w:vAlign w:val="center"/>
-            <w:tcMar>
-              <w:top w:w="85" w:type="dxa"/>
-              <w:bottom w:w="85" w:type="dxa"/>
-              <w:left w:w="100" w:type="dxa"/>
-              <w:right w:w="100" w:type="dxa"/>
-            </w:tcMar>
-            <w:shd w:fill="F2F5F8"/>
-          </w:tcPr>
-          <w:p>
-            <w:pPr>
-              <w:widowControl/>
-              <w:spacing w:after="0" w:line="278" w:lineRule="auto"/>
-            </w:pPr>
-            <w:r>
-              <w:rPr>
-                <w:sz w:val="20"/>
-              </w:rPr>
-              <w:t>直接理想格实例及物联网应用</w:t>
-            </w:r>
-          </w:p>
-        </w:tc>
-        <w:tc>
-          <w:tcPr>
-            <w:tcW w:type="dxa" w:w="2952"/>
-            <w:vAlign w:val="center"/>
-            <w:tcMar>
-              <w:top w:w="85" w:type="dxa"/>
-              <w:bottom w:w="85" w:type="dxa"/>
-              <w:left w:w="100" w:type="dxa"/>
-              <w:right w:w="100" w:type="dxa"/>
-            </w:tcMar>
-            <w:shd w:fill="F2F5F8"/>
-          </w:tcPr>
-          <w:p>
-            <w:pPr>
-              <w:widowControl/>
-              <w:spacing w:after="0" w:line="278" w:lineRule="auto"/>
-            </w:pPr>
-            <w:r>
-              <w:rPr>
-                <w:sz w:val="20"/>
-              </w:rPr>
-              <w:t>正式认证游戏和完整性是否适配</w:t>
-            </w:r>
-          </w:p>
-        </w:tc>
-      </w:tr>
-    </w:tbl>
+    <w:p>
+      <w:r>
+        <w:t>Boyen–Li §1 和 §3 的 Definition 5 进一步研究目标接收者持有自己的密钥、但尚未匹配发送者时的消息保护。正常客户端返回失败，不能证明控制密钥与客户端的用户无法读到中间明文。其构造增加匿名 IBE、提取器、可复用提取器及身份熵等条件。该性质不属于本项目实现与验收范围，也不在报告中宣称。[S5]</w:t>
+      </w:r>
+    </w:p>
+    <w:p>
+      <w:r>
+        <w:t>因此，公开用户名、学号等身份不需要为本项目另行强行赋予 Boyen–Li 所需的秘密熵；身份认证与发钥仍须可靠。API 保持错误发送者和错误接收者返回失败。安全报告明确区分普通隐私、加强认证、接口匹配和密文完整性。</w:t>
+      </w:r>
+    </w:p>
     <w:p>
       <w:pPr>
-        <w:spacing w:after="60" w:before="0" w:line="120" w:lineRule="auto"/>
+        <w:pStyle w:val="Heading2"/>
       </w:pPr>
       <w:r>
-        <w:rPr>
-          <w:sz w:val="4"/>
-        </w:rPr>
+        <w:t>8.3 其它 IBME 文献作为相关工作</w:t>
       </w:r>
     </w:p>
     <w:p>
       <w:r>
-        <w:t>Wang 等方案直接支持当前的 HIBE 加 IBS 思路，可作为第一套数学参考实例。我们需要按论文真正要求的原语重建，而不是把当前运行成功的后端视作证明已经成立。[S1]</w:t>
+        <w:t>前期已检索的匿名 IBE 加提取器、增强隐私 CCA、直接环格 IBME 等路线保留为背景文献，不列入本次开发里程碑。2026 年 Yu 等关于重复发送密钥认证的研究仍可用于审查查询一致性；本文只核验过其摘要与构造概述，不能据此宣布既有方案失效或改换通用构造。[S3]</w:t>
       </w:r>
     </w:p>
     <w:p>
       <w:r>
-        <w:t>Boyen 与 Li 的论文属于 ESORICS 2023 会议论文集，出版于 2024 年。其增强隐私路线需要匿名 IBE、IBS，以及提取与可复用提取机制和身份熵前提。低熵的公开用户名不会因为哈希一次就产生新的秘密熵，因此应用身份设计与密码学假设必须一起考虑。[S5]</w:t>
-      </w:r>
-    </w:p>
-    <w:p>
-      <w:r>
-        <w:t>ACNS 2024 的另一条路线使用匿名 IBE、可复用计算提取器，并用上下文隐藏同态签名补充认证。它与当前 HIBE 委派路线的证明组件不同，值得作为理论比较候选，但暂未核验全文的实际算法与参数。[S6]</w:t>
-      </w:r>
-    </w:p>
-    <w:p>
-      <w:r>
-        <w:rPr>
-          <w:b/>
-        </w:rPr>
-        <w:t>版本变化会改变路线判断。</w:t>
-      </w:r>
-      <w:r>
-        <w:t xml:space="preserve"> ePrint 2023/1435 本次核验的最新版本为 2026 年 7 月 6 日修订稿，当前标题是 Identity-Based Matchmaking Encryption with Enhanced Privacy Against Chosen-Ciphertext Attacks，修订说明明确提到修复通用构造的技术缺陷。当前 §5 涉及匿名 IBE、普通数字签名、模拟可靠且可提取的 NIZK 和可复用提取器。不能沿用旧缓存标题或旧版本的简单组件对比，宣称已经得到当前版本的高效格实例。[S7]</w:t>
-      </w:r>
-    </w:p>
-    <w:p>
-      <w:r>
-        <w:t>ACISP 2026 的 Li、Qin、Boyen 工作在出版社摘要中宣称增强隐私、选择密文安全以及已实现格实例。它与赛题关注点接近，应该优先取得全文和实现材料，再判断能否成为主路线。本次没有核验其完整证明、参数和性能，不填写未经确认的实现收益。[S8]</w:t>
-      </w:r>
-    </w:p>
-    <w:p>
-      <w:r>
-        <w:t>TCS 2026 的 Yu 等工作讨论复用同一发送密钥时的更强认证，并提出利用密文伪随机 IBE 与 IBS 的路线。这个方向可能减少 HIBE 委派开销，但“只需 IBE”不表示任意普通 IBE 都可替换，也不能自动提供错误发送者条件下的增强隐私。全文证明和参数仍需精读。[S3]</w:t>
-      </w:r>
-    </w:p>
-    <w:p>
-      <w:r>
-        <w:t>IBMEIL 的出版社摘要给出 RLWE 和环上非齐次 SIS 路线。它可以作为直接环格候选，优先核对完整算法、攻击者发钥和签名权限、同一密钥复用，以及篡改拒绝定义。本次仅凭摘要，不能把它排为最优或宣称已满足自我伪造目标。[S9]</w:t>
-      </w:r>
-    </w:p>
-    <w:p>
-      <w:r>
-        <w:t>早期 Match Me If You Can 及 Chen 等标准假设构造有助于比较定义和组合思想，但其双线性对路线不能作为抗量子格实例交付。它们适合理论对照，不适合与安全目标不同的格实现混在同一张速度排名表。[S10][S11]</w:t>
+        <w:t>第 18 节保留初次调研的版本记录，其中 [S6]、[S7]、[S8]、[S9]、[S16]、[S17] 的列入不表示计划实现这些协议。论文版本修订和摘要级证据的边界仍须保留。</w:t>
       </w:r>
     </w:p>
     <w:p>
@@ -8262,7 +7359,17 @@
     </w:p>
     <w:p>
       <w:r>
+        <w:t>本轮进一步核对了 Pan Wagner 与 Sageloli 的签名查询游戏：它们在签名查询中重新调用 KeyExt，而自适应转换的发钥会重新采样身份盐。实际系统的一次发钥、多次发送需要另行审查联合分布与证明适配，不能简单加入缓存后沿用全部结论。Foo Li 已明确处理一致性，因此与 ABB10 一起列为下一轮优先精读对象；这不是最终选型，也不是对其它论文安全性的否定。</w:t>
+      </w:r>
+    </w:p>
+    <w:p>
+      <w:r>
         <w:t>Sageloli 等提供 SIS、RSIS 实例、具体参数表及参数计算材料。其三进制 gadget 对应模数形式与当前二进制工具不同，不能复用二进制拆分后直接标为论文实现。这条路线可以同时支持矩阵和环格 IBS 比较，是时间充分条件下应纳入的候选。[S14]</w:t>
+      </w:r>
+    </w:p>
+    <w:p>
+      <w:r>
+        <w:t>具体成本仍须仔细判断：该论文 §8.1 的 Table 7 对基本环格实例 ParamI 给出 20 Mo 签名与 699 Mo 用户密钥，原文估计为 129 bits。它们是论文概念验证参数的理论结果，不是本项目实测；完整自适应实例还需盐、编码和查询损失。首轮因此保留其研究价值，但不因“短签名”名称直接选作竞赛主后端。[S14]</w:t>
       </w:r>
     </w:p>
     <w:p>
@@ -8275,22 +7382,17 @@
         <w:pStyle w:val="Heading2"/>
       </w:pPr>
       <w:r>
-        <w:t>9.2 HIBE 与匿名 IBE 候选</w:t>
+        <w:t>9.2 两层匿名 HIBE 候选</w:t>
       </w:r>
     </w:p>
     <w:p>
       <w:r>
-        <w:t>若选择 HIBE 加 IBS，建议首先精确实现 ABB10 CRYPTO 2010 的两层算法，标明选用 §4 ROM 构造与定理前提。标准模型版本属于另一种实例，应单独审查。Latte 有公开实现和结构化格优化价值，但普通 HIBE 的机密性或 CCA 性质并不自动包含所需的匿名性；在匿名性证据明确前，它适合性能和委派机制研究。[S4][S15]</w:t>
+        <w:t>首先核验 ABB10 CRYPTO 2010 的 §4 ROM 构造、Theorem 5 和两层参数，作为论文对应最直接的 HIBE 参考候选。标准模型版本属于另一种实例，应单独审查。Bonsai Trees 等矩阵委派方案用于扩展比较。Latte 有公开实现和结构化格优化价值，但普通 HIBE 的机密性或 CCA 性质并不自动包含所需的匿名性；在匿名性证据明确前，它适合单独研究性能和委派机制，不作为已获准的 IBME 后端。[S4][S15]</w:t>
       </w:r>
     </w:p>
     <w:p>
       <w:r>
-        <w:t>若选择匿名 IBE 组合，值得重点研究 Tomita 与 Shikata 的 ePrint 2024/1765。当前版本于 2026 年 4 月 22 日修订，基于 Module-LWE，涉及紧凑近似陷门和自适应匿名性在 ROM 与 QROM 中的证明。本次已读取构造、参数条件与安全证明入口。它提供了具体的模格研究入口，而不是仅在计划里写“将来支持 Module-LWE”。[S16]</w:t>
-      </w:r>
-    </w:p>
-    <w:p>
-      <w:r>
-        <w:t>这项研究的渐近紧凑性不等于现成的工程参数优于所有旧方案。其条件涉及近似原像误差、环模数及噪声，且最新版本修改了参数条件。需要推导具体尺寸与失败概率后，才能排名。其 PQCrypto 2024 环格前身也应与当前模格版本分开冻结，不能混用旧参数和新定理。[S16][S17]</w:t>
+        <w:t>Tomita 与 Shikata 的 Module-LWE 匿名 IBE 等文献可提供模格陷门与参数研究参考，但普通匿名 IBE 没有自动获得两层密钥委派能力。只有取得满足相应匿名和自适应安全定义的完整 HIBE 构造后，才可纳入本项目端到端实例。不能把已存在匿名 IBE 写成已存在可替换 HIBE，也不为接入它重新设计另一套通用协议。[S16][S17]</w:t>
       </w:r>
     </w:p>
     <w:p>
@@ -8778,7 +7880,7 @@
     </w:p>
     <w:p>
       <w:r>
-        <w:t>允许采用混合组合，例如 Module-LWE 匿名 IBE 加矩阵 SIS IBS，但应如实说明两种底层假设和各自瓶颈。它可以作为多类格组件灵活组合的成果，不应伪称为全部组件都是模格的方案。</w:t>
+        <w:t>允许在固定通用构造内采用混合组合，例如矩阵 LWE 匿名 HIBE 加 Ring-SIS IBS。应如实说明两种底层假设和各自瓶颈，不能将其标为所有组件都基于环格。Module-LWE 加密组件仍须满足 HIBE 准入条件。</w:t>
       </w:r>
     </w:p>
     <w:p>
@@ -8786,12 +7888,12 @@
         <w:pStyle w:val="Heading1"/>
       </w:pPr>
       <w:r>
-        <w:t>10 主路线决策方法与建议顺序</w:t>
+        <w:t>10 固定通用构造下的原语选型顺序</w:t>
       </w:r>
     </w:p>
     <w:p>
       <w:r>
-        <w:t>先为每个通用构造建立“能力清单”：需要匿名 IBE 还是匿名 HIBE；需不需要密文伪随机；认证是否允许目标用户持有自己的接收密钥；是否有解密查询；能否复用发送密钥；提取器是否需要身份熵；是否需要证明系统；每项定理适用经典还是量子攻击者。</w:t>
+        <w:t>先冻结原语准入条件：HIBE 支持两层身份与正确委派，满足王老师定义所需的自适应匿名隐私；IBS 支持自适应身份与消息查询，满足加强认证归约。逐项检查重复取钥、同一密钥多次发送、随机预言机查询和经典或量子攻击者范围。[S1]</w:t>
       </w:r>
     </w:p>
     <w:p>
@@ -8801,12 +7903,12 @@
     </w:p>
     <w:p>
       <w:r>
-        <w:t>建议的推进顺序如下。先建立修正后的 HIBE 加 IBS 矩阵参考实例，用于理解、差分测试和安全条件审查；同时精读 2026 年增强隐私 CCA 及重复密钥认证论文，选定面向赛题的主协议。随后实现第二套通用构造或组件组合，再落实环格 IBS 与模格匿名 IBE，形成可运行的结构化格比较。</w:t>
+        <w:t>本轮先完成安全目标、首轮原语核验和明确的下一任务。随后落实 ABB10 候选的算法与参数对应，以及 Wang 加自适应转换、Foo Li、Sageloli 等 IBS 的完整成本比较。选定原语后建立矩阵参考实例，研究密文完整性封装，再接入另一套 IBS 或 HIBE 后端，形成同一通用构造下的实例切换。</w:t>
       </w:r>
     </w:p>
     <w:p>
       <w:r>
-        <w:t>这并不要求一定保留 HIBE 加 IBS 为最终展示主方案。如果匿名 IBE 路线的完整性、增强隐私和实际参数更适合，允许将其提升为主路线。保留第一套参考实例的价值在于提供独立可审查基线，而不是为了延续已有文件名。</w:t>
+        <w:t>HIBE 和 IBS 分别选择，不必共用模数、维度或同一论文。优先调查 Ring-SIS IBS 的完整方案，模格身份原语保持具体研究任务；未满足两层匿名 HIBE 条件的加密组件不能进入正式组合。</w:t>
       </w:r>
     </w:p>
     <w:p>
@@ -9175,7 +8277,7 @@
               <w:rPr>
                 <w:sz w:val="20"/>
               </w:rPr>
-              <w:t>能否自我伪造 或绕过匹配获得消息</w:t>
+              <w:t>能否冒充没有发送密钥的身份进行自我伪造</w:t>
             </w:r>
           </w:p>
         </w:tc>
@@ -9285,7 +8387,7 @@
               <w:rPr>
                 <w:sz w:val="20"/>
               </w:rPr>
-              <w:t>选择密文攻击者</w:t>
+              <w:t>完整性审查对手</w:t>
             </w:r>
           </w:p>
         </w:tc>
@@ -9310,7 +8412,7 @@
               <w:rPr>
                 <w:sz w:val="20"/>
               </w:rPr>
-              <w:t>按游戏约束查询解密接口</w:t>
+              <w:t>修改胶囊 头部或消息体</w:t>
             </w:r>
           </w:p>
         </w:tc>
@@ -9335,7 +8437,7 @@
               <w:rPr>
                 <w:sz w:val="20"/>
               </w:rPr>
-              <w:t>非挑战密文查询能否泄露挑战信息</w:t>
+              <w:t>能否在保留明文时让非法修改仍被接受</w:t>
             </w:r>
           </w:p>
         </w:tc>
@@ -9437,6 +8539,11 @@
       </w:r>
     </w:p>
     <w:p>
+      <w:r>
+        <w:t>普通隐私和加强认证按 Wang 定义分别处理。本项目不承诺针对持有目标接收密钥、未匹配发送者的用户实现增强隐私。CCA 只在选定认证封装有相应完整论证后作为独立性质声明，不能自动由基本 CPA 构造继承。</w:t>
+      </w:r>
+    </w:p>
+    <w:p>
       <w:pPr>
         <w:pStyle w:val="Heading2"/>
       </w:pPr>
@@ -9538,7 +8645,7 @@
         <w:pStyle w:val="ListNumber"/>
       </w:pPr>
       <w:r>
-        <w:t>ROM 或 QROM 归约损失、允许查询次数、身份空间与提取器条件。</w:t>
+        <w:t>ROM 或 QROM 归约损失、允许查询次数、身份空间与密钥复用条件。</w:t>
       </w:r>
     </w:p>
     <w:p>
@@ -9666,7 +8773,7 @@
     </w:p>
     <w:p>
       <w:r>
-        <w:t>固定选择“128 位”可以作为团队研究目标，但需明确是哪个成本模型下的估计值、哪些组件的归约，以及身份熵和统计误差等前提。不能把估计器输出的一列数字当作 NIST 等级或形式证明。</w:t>
+        <w:t>固定选择“128 位”可以作为团队研究目标，但需明确是哪个成本模型下的估计值、哪些组件的归约，以及查询数量和统计误差等前提。不能把估计器输出的一列数字当作 NIST 等级或形式证明。</w:t>
       </w:r>
     </w:p>
     <w:p>
@@ -9757,7 +8864,7 @@
     </w:p>
     <w:p>
       <w:r>
-        <w:t xml:space="preserve">建议新增完整的方案注册体系，让配置明确选择通用构造、加密后端、签名后端、提取器或证明系统、参数集及安全能力。HIBE 路线与 IBE 路线的接口不同，不应伪造一个没有意义的 </w:t>
+        <w:t xml:space="preserve">建议新增完整的方案注册体系，固定协议标识为 Wang 的 HIBE 加 IBS 组合，让配置选择 HIBE 后端、IBS 后端、认证封装版本、参数集及安全能力。普通 IBE 缺少委派能力，不能伪造一个没有意义的 </w:t>
       </w:r>
       <w:r>
         <w:rPr>
@@ -9767,7 +8874,7 @@
         <w:t>derive</w:t>
       </w:r>
       <w:r>
-        <w:t xml:space="preserve"> 来硬凑兼容。</w:t>
+        <w:t xml:space="preserve"> 来硬凑兼容。不开发提取器或增强隐私协议插件。</w:t>
       </w:r>
     </w:p>
     <w:p>
@@ -10599,7 +9706,7 @@
     </w:p>
     <w:p>
       <w:r>
-        <w:t>增强隐私测试应允许恶意接收者观察中间值，并研究低熵身份枚举。测试可发现问题，定理与身份熵论证才支撑完整安全结论。不能把客户端界面不显示消息当作测试通过。</w:t>
+        <w:t>针对恶意接收者的本轮安全测试聚焦自我伪造：即使掌握自己的接收密钥，也不能冒充没有发送密钥的 Alice。正常 API 的错误发送者拒绝仍需测试；该功能不写成增强隐私证明，不设置 Boyen–Li 身份熵或中间值保密的验收项。</w:t>
       </w:r>
     </w:p>
     <w:p>
@@ -10681,7 +9788,7 @@
     </w:p>
     <w:p>
       <w:r>
-        <w:t>特别值得研究“短签名是否仍是主瓶颈”。当前逐比特封装会极大放大签名尺寸；换成胶囊消息体结构后，胶囊或采样时间可能成为主成本。优化对象会随构造改变，应由新基准决定，而不是只沿着旧原型的性能比例做决策。</w:t>
+        <w:t>特别值得研究“短签名是否仍是主瓶颈”。当前逐比特封装会极大放大签名尺寸；经论证采用胶囊消息体包装后，胶囊或采样时间可能成为主成本。优化对象会随后端和包装改变，应由新基准决定。</w:t>
       </w:r>
     </w:p>
     <w:p>
@@ -10694,7 +9801,7 @@
     </w:p>
     <w:p>
       <w:r>
-        <w:t>可以选择以下问题作为主要贡献，但需要结果出来后才能宣称收益或创新：在相同认证模型下，完整 IBS 候选的签名与采样成本差异；在相同通用构造下，矩阵与环格实例的尺寸及委派成本差异；模格匿名 IBE 与矩阵 IBS 混合组合的实际瓶颈；认证胶囊方案对篡改拒绝和大消息效率的影响；缓存、序列化和原生运算的安全保持优化。</w:t>
+        <w:t>可以选择以下问题作为主要贡献，但需要结果出来后才能宣称收益或创新：在相同认证模型下，完整 IBS 候选的签名与采样成本差异；在相同通用构造下，矩阵与环格组件的尺寸及委派成本差异；LWE 匿名 HIBE 与 Ring-SIS IBS 混合组合的实际瓶颈；认证封装对篡改拒绝和大消息效率的影响；缓存、序列化和原生运算的安全保持优化。</w:t>
       </w:r>
     </w:p>
     <w:p>
@@ -10725,12 +9832,12 @@
     </w:p>
     <w:p>
       <w:r>
-        <w:t>输出更新后的安全目标、赛题对应表、文献和代码版本目录，以及用户身份、系统中心和密钥复用的应用语义。归档近期论文的版本与哈希，取得目前只有摘要的优先候选全文。</w:t>
+        <w:t>输出已确认的 Wang 通用构造、普通隐私和加强认证目标、赛题对应表、文献和代码版本目录，以及用户身份、系统中心和密钥复用的应用语义。明确不实施增强隐私。归档首轮 HIBE 和 IBS 文献的版本、哈希及证据位置。</w:t>
       </w:r>
     </w:p>
     <w:p>
       <w:r>
-        <w:t>验收条件是每项核心性质都有可定位的定义和候选定理；未核验前提明确列出，官方要求与内部目标分开。这个阶段要修订旧接口规范的适用范围，不能让新的 IBE 路线默默违反旧 HIBE 接口。</w:t>
+        <w:t>验收条件是每项核心性质都有可定位的定义和候选定理；未核验前提明确列出，官方要求与内部目标分开。架构、接口规范、协作提示和报告必须一致，不能继续把增强隐私列为待开发里程碑。</w:t>
       </w:r>
     </w:p>
     <w:p>
@@ -10743,7 +9850,7 @@
     </w:p>
     <w:p>
       <w:r>
-        <w:t>输出完整 IBME 路线比较、每个候选原语的算法定理对应表、状态和查询一致性审查，以及主路线与参考路线决定。优先读取 Yu 等 TCS 2026、Li Qin Boyen ACISP 2026 和当前 Chiku 修订稿的相关安全定义。</w:t>
+        <w:t>输出 HIBE 和 IBS 的原语准入矩阵、算法定理对应表、状态与查询一致性审查，以及参考后端和优化候选决定。优先核验 ABB10 的具体 HIBE 构造，以及 Wang 完整转换版本、Pan Wagner、Foo Li 和 Sageloli 的 IBS。首轮之后再扩展其它 HIBE 候选。</w:t>
       </w:r>
     </w:p>
     <w:p>
@@ -10797,7 +9904,7 @@
     </w:p>
     <w:p>
       <w:r>
-        <w:t>输出环格 IBS 或直接环格 IBME 的完整实例研究，模格匿名 IBE 的具体参数与实现，并构成至少另一套可切换的真实方案或组合。纯 Module-SIS IBS 若没有成熟可核验候选，应另列研究课题，不冒充完成。</w:t>
+        <w:t>输出已有 Ring-SIS IBS 的完整算法、参数与实现研究，在同一通用构造中形成至少另一套可切换组合。环格和模格 HIBE 只有在两层匿名、自适应安全和采样条件都明确后才进入实现。纯 Module-SIS IBS 若没有成熟可核验候选，应另列研究课题，不冒充完成。</w:t>
       </w:r>
     </w:p>
     <w:p>
@@ -10851,12 +9958,12 @@
     </w:p>
     <w:p>
       <w:r>
-        <w:t>第一，赛题的自我伪造和完整性要求具体对应哪一种认证游戏？要从几篇 IBME 的定义比较开始，确认恶意接收者权限、重复发送密钥和解密查询，再确定主协议。</w:t>
+        <w:t>第一，Wang 的 Definition 10 如何覆盖自我伪造，其“新消息”条件与赛题要求的密文字节篡改拒绝有什么差异？固定基本组合后，需要明确额外认证封装的目标与证明，不降低已有篡改验收。</w:t>
       </w:r>
     </w:p>
     <w:p>
       <w:r>
-        <w:t>第二，选择 HIBE 委派还是匿名 IBE 组合？要比较完整定理、采样、身份熵、额外提取器或证明系统，以及具体运行成本。普通 IBE 可减少委派不等于整体一定更快。</w:t>
+        <w:t>第二，ABB10 两层 HIBE 的实际矩阵、委派、采样和参数如何对应代码？需要分清原论文算法与现有拼接式教学后端，并量化委派宽度及归约损失。</w:t>
       </w:r>
     </w:p>
     <w:p>
@@ -10871,7 +9978,7 @@
     </w:p>
     <w:p>
       <w:r>
-        <w:t>第五，哪些结构化格候选能形成真正完整的实例？已有模格匿名 IBE 和环格 IBS 可以作为入口；Module-SIS 身份签名和匿名 HIBE 的困难不应被普通 KEM 或签名名称掩盖。</w:t>
+        <w:t>第五，哪些结构化格组件能在固定通用构造下形成完整实例？先核验已有 Ring-SIS IBS；Module-SIS 身份签名和两层匿名 HIBE 需要完整算法与定理，不能用普通 KEM、匿名 IBE 或普通签名替代。</w:t>
       </w:r>
     </w:p>
     <w:p>
@@ -10894,7 +10001,7 @@
     </w:p>
     <w:p>
       <w:r>
-        <w:t xml:space="preserve">本次完成远端检查与快进同步、用户 PDF 正文和页面核验、现有代码与新研究资料检查、原始文献补充检索、全套测试、公开参数伪造复现及一字节密文篡改实验。报告附 </w:t>
+        <w:t xml:space="preserve">初次核验完成远端检查与快进同步、用户 PDF 正文和页面核验、现有代码与新研究资料检查、原始文献补充检索、全套测试、公开参数伪造复现及一字节密文篡改实验。报告附 </w:t>
       </w:r>
       <w:r>
         <w:rPr>
@@ -10909,7 +10016,7 @@
     </w:p>
     <w:p>
       <w:r>
-        <w:t>本机新测试环境为 Windows 11、CPython 3.14.6、Intel Core Ultra 9 275HX、24 个逻辑处理器、约 32 GB 内存。WSL 的指定 conda 环境已确认 SageMath 10.9 可用，但本次没有用 Sage 新做参数估计或数学采样实验。历史基准的处理器记录仅是其原始标识，不能用本次机器名称替换旧实验环境。</w:t>
+        <w:t>初次核验的环境为 Windows 11、CPython 3.14.6、Intel Core Ultra 9 275HX、24 个逻辑处理器、约 32 GB 内存。WSL 的指定 conda 环境已确认 SageMath 10.9 可用，但未用 Sage 新做参数估计或数学采样实验。历史基准的处理器记录仅是其原始标识，不能用核验机器名称替换旧实验环境。</w:t>
       </w:r>
     </w:p>
     <w:p>
@@ -10964,13 +10071,38 @@
     </w:p>
     <w:p>
       <w:r>
-        <w:t>本次没有更改任何密码算法，没有修复已发现漏洞，没有完成正式参数、增强隐私、CCA 转换、环格或模格后端，也没有重新运行历史完整基准及旧 LLL 或 LWE 估计。报告的安全声明是：</w:t>
+        <w:t>初次核验没有更改任何密码算法，没有修复已发现漏洞，没有完成正式参数、CCA 转换、环格或模格后端，也没有重新运行历史完整基准及旧 LLL 或 LWE 估计。增强隐私已经排除出项目范围。报告的安全声明是：</w:t>
       </w:r>
       <w:r>
         <w:rPr>
           <w:b/>
         </w:rPr>
-        <w:t>当前教学实例不提供安全等级；本次测试不能替代安全证明。</w:t>
+        <w:t>当前教学实例不提供安全等级；测试不能替代安全证明。</w:t>
+      </w:r>
+    </w:p>
+    <w:p>
+      <w:r>
+        <w:t xml:space="preserve">本次修订同步项目范围与协作材料，并开启原语准入条件和首轮文献核验；结果见同目录 </w:t>
+      </w:r>
+      <w:r>
+        <w:rPr>
+          <w:rFonts w:ascii="Consolas" w:hAnsi="Consolas"/>
+          <w:sz w:val="19"/>
+        </w:rPr>
+        <w:t>原语选型第一轮核验.md</w:t>
+      </w:r>
+      <w:r>
+        <w:t xml:space="preserve">，进度与下一任务见 </w:t>
+      </w:r>
+      <w:r>
+        <w:rPr>
+          <w:rFonts w:ascii="Consolas" w:hAnsi="Consolas"/>
+          <w:sz w:val="19"/>
+        </w:rPr>
+        <w:t>docs/PROJECT_RESTART.md</w:t>
+      </w:r>
+      <w:r>
+        <w:t>。文档更新不表示新密码后端、参数估计或完整性修复已经完成。</w:t>
       </w:r>
     </w:p>
     <w:p>
@@ -11887,7 +11019,7 @@
     </w:pPr>
     <w:r>
       <w:rPr>
-        <w:color w:val="595959"/>
+        <w:color w:val="000000"/>
         <w:sz w:val="16"/>
       </w:rPr>
       <w:t>IBME 项目研究报告  |  2026 年 10 月</w:t>

</xml_diff>